<commit_message>
Update activity report for Submit Report redesign
</commit_message>
<xml_diff>
--- a/screenshots/report_form/ACTIVITY_REPORT.docx
+++ b/screenshots/report_form/ACTIVITY_REPORT.docx
@@ -20,8 +20,8 @@
           <w:szCs w:val="24"/>
         </w:rPr>
         <w:drawing>
-          <wp:inline distT="0" distB="0" distL="0" distR="0" wp14:anchorId="0C1B2B70" wp14:editId="375B3451">
-            <wp:extent cx="5943600" cy="3131185"/>
+          <wp:inline distT="0" distB="0" distL="0" distR="0" wp14:anchorId="63A88E15" wp14:editId="47649D25">
+            <wp:extent cx="5943600" cy="3167380"/>
             <wp:effectExtent l="0" t="0" r="0" b="0"/>
             <wp:docPr id="1" name="Picture 1"/>
             <wp:cNvGraphicFramePr/>
@@ -47,7 +47,7 @@
                   <pic:spPr>
                     <a:xfrm>
                       <a:off x="0" y="0"/>
-                      <a:ext cx="5943600" cy="3131185"/>
+                      <a:ext cx="5943600" cy="3167380"/>
                     </a:xfrm>
                     <a:prstGeom prst="rect">
                       <a:avLst/>
@@ -107,7 +107,7 @@
           <w:szCs w:val="24"/>
         </w:rPr>
         <w:drawing>
-          <wp:inline distT="0" distB="0" distL="0" distR="0" wp14:anchorId="2184FAA8" wp14:editId="6A416A3F">
+          <wp:inline distT="0" distB="0" distL="0" distR="0" wp14:anchorId="4A486532" wp14:editId="3A2A5385">
             <wp:extent cx="5943600" cy="3167380"/>
             <wp:effectExtent l="0" t="0" r="0" b="0"/>
             <wp:docPr id="2" name="Picture 2"/>
@@ -194,7 +194,7 @@
           <w:szCs w:val="24"/>
         </w:rPr>
         <w:drawing>
-          <wp:inline distT="0" distB="0" distL="0" distR="0" wp14:anchorId="749C228C" wp14:editId="036053E2">
+          <wp:inline distT="0" distB="0" distL="0" distR="0" wp14:anchorId="16AEB9A9" wp14:editId="0BD32517">
             <wp:extent cx="5943600" cy="3167380"/>
             <wp:effectExtent l="0" t="0" r="0" b="0"/>
             <wp:docPr id="3" name="Picture 3"/>
@@ -261,7 +261,7 @@
           <w:szCs w:val="24"/>
         </w:rPr>
         <w:drawing>
-          <wp:inline distT="0" distB="0" distL="0" distR="0" wp14:anchorId="073CD6A7" wp14:editId="230869A1">
+          <wp:inline distT="0" distB="0" distL="0" distR="0" wp14:anchorId="2AED2B34" wp14:editId="37B7930D">
             <wp:extent cx="5943600" cy="3167380"/>
             <wp:effectExtent l="0" t="0" r="0" b="0"/>
             <wp:docPr id="4" name="Picture 4"/>
@@ -328,7 +328,7 @@
           <w:szCs w:val="24"/>
         </w:rPr>
         <w:drawing>
-          <wp:inline distT="0" distB="0" distL="0" distR="0" wp14:anchorId="7164FA58" wp14:editId="75E14E2A">
+          <wp:inline distT="0" distB="0" distL="0" distR="0" wp14:anchorId="68E6491F" wp14:editId="7610BBE6">
             <wp:extent cx="5943600" cy="3167380"/>
             <wp:effectExtent l="0" t="0" r="0" b="0"/>
             <wp:docPr id="5" name="Picture 5"/>
@@ -395,7 +395,7 @@
           <w:szCs w:val="24"/>
         </w:rPr>
         <w:drawing>
-          <wp:inline distT="0" distB="0" distL="0" distR="0" wp14:anchorId="2BCF3162" wp14:editId="3677EC72">
+          <wp:inline distT="0" distB="0" distL="0" distR="0" wp14:anchorId="38483A59" wp14:editId="28DD263D">
             <wp:extent cx="5943600" cy="3167380"/>
             <wp:effectExtent l="0" t="0" r="0" b="0"/>
             <wp:docPr id="6" name="Picture 6"/>
@@ -861,7 +861,7 @@
     <w:link w:val="Heading1Char"/>
     <w:uiPriority w:val="9"/>
     <w:qFormat/>
-    <w:rsid w:val="00606EB7"/>
+    <w:rsid w:val="00F81F77"/>
     <w:pPr>
       <w:keepNext/>
       <w:keepLines/>
@@ -883,7 +883,7 @@
     <w:uiPriority w:val="9"/>
     <w:unhideWhenUsed/>
     <w:qFormat/>
-    <w:rsid w:val="00606EB7"/>
+    <w:rsid w:val="00F81F77"/>
     <w:pPr>
       <w:keepNext/>
       <w:keepLines/>
@@ -905,7 +905,7 @@
     <w:uiPriority w:val="9"/>
     <w:unhideWhenUsed/>
     <w:qFormat/>
-    <w:rsid w:val="00606EB7"/>
+    <w:rsid w:val="00F81F77"/>
     <w:pPr>
       <w:keepNext/>
       <w:keepLines/>
@@ -951,7 +951,7 @@
     <w:basedOn w:val="DefaultParagraphFont"/>
     <w:link w:val="Heading1"/>
     <w:uiPriority w:val="9"/>
-    <w:rsid w:val="00606EB7"/>
+    <w:rsid w:val="00F81F77"/>
     <w:rPr>
       <w:rFonts w:asciiTheme="majorHAnsi" w:eastAsiaTheme="majorEastAsia" w:hAnsiTheme="majorHAnsi" w:cstheme="majorBidi"/>
       <w:color w:val="2F5496" w:themeColor="accent1" w:themeShade="BF"/>
@@ -964,7 +964,7 @@
     <w:basedOn w:val="DefaultParagraphFont"/>
     <w:link w:val="Heading2"/>
     <w:uiPriority w:val="9"/>
-    <w:rsid w:val="00606EB7"/>
+    <w:rsid w:val="00F81F77"/>
     <w:rPr>
       <w:rFonts w:asciiTheme="majorHAnsi" w:eastAsiaTheme="majorEastAsia" w:hAnsiTheme="majorHAnsi" w:cstheme="majorBidi"/>
       <w:color w:val="2F5496" w:themeColor="accent1" w:themeShade="BF"/>
@@ -977,7 +977,7 @@
     <w:basedOn w:val="DefaultParagraphFont"/>
     <w:link w:val="Heading3"/>
     <w:uiPriority w:val="9"/>
-    <w:rsid w:val="00606EB7"/>
+    <w:rsid w:val="00F81F77"/>
     <w:rPr>
       <w:rFonts w:asciiTheme="majorHAnsi" w:eastAsiaTheme="majorEastAsia" w:hAnsiTheme="majorHAnsi" w:cstheme="majorBidi"/>
       <w:color w:val="1F3763" w:themeColor="accent1" w:themeShade="7F"/>

</xml_diff>